<commit_message>
Add valuation section to fiscal land analysis (md + docx)
Co-Authored-By: Claude Opus 4.8 <noreply@anthropic.com>
Claude-Session: https://claude.ai/code/session_0176Mxnp8jDMs1stsmMK1Rkb
</commit_message>
<xml_diff>
--- a/Informe_terrenos_fiscales_Chile.docx
+++ b/Informe_terrenos_fiscales_Chile.docx
@@ -1624,6 +1624,579 @@
         <w:pStyle w:val="Heading1"/>
       </w:pPr>
       <w:r>
+        <w:t>6 bis. Valorizacion de orden de magnitud (joyas disponibles)</w:t>
+      </w:r>
+    </w:p>
+    <w:p>
+      <w:r>
+        <w:rPr>
+          <w:b w:val="0"/>
+          <w:i/>
+        </w:rPr>
+        <w:t>Supuestos: valor de suelo de referencia por comuna (UF/m2, mercado 2026); 1 UF = $40.408; USD ~ $950. Estimacion, NO tasacion.</w:t>
+      </w:r>
+    </w:p>
+    <w:tbl>
+      <w:tblPr>
+        <w:tblStyle w:val="LightGrid-Accent1"/>
+        <w:tblW w:type="auto" w:w="0"/>
+        <w:tblLook w:firstColumn="1" w:firstRow="1" w:lastColumn="0" w:lastRow="0" w:noHBand="0" w:noVBand="1" w:val="04A0"/>
+      </w:tblPr>
+      <w:tblGrid>
+        <w:gridCol w:w="2160"/>
+        <w:gridCol w:w="2160"/>
+        <w:gridCol w:w="2160"/>
+        <w:gridCol w:w="2160"/>
+      </w:tblGrid>
+      <w:tr>
+        <w:tc>
+          <w:tcPr>
+            <w:tcW w:type="dxa" w:w="2160"/>
+          </w:tcPr>
+          <w:p>
+            <w:r>
+              <w:rPr>
+                <w:b/>
+              </w:rPr>
+              <w:t>Predio</w:t>
+            </w:r>
+          </w:p>
+        </w:tc>
+        <w:tc>
+          <w:tcPr>
+            <w:tcW w:type="dxa" w:w="2160"/>
+          </w:tcPr>
+          <w:p>
+            <w:r>
+              <w:rPr>
+                <w:b/>
+              </w:rPr>
+              <w:t>Comuna</w:t>
+            </w:r>
+          </w:p>
+        </w:tc>
+        <w:tc>
+          <w:tcPr>
+            <w:tcW w:type="dxa" w:w="2160"/>
+          </w:tcPr>
+          <w:p>
+            <w:r>
+              <w:rPr>
+                <w:b/>
+              </w:rPr>
+              <w:t>UF/m2</w:t>
+            </w:r>
+          </w:p>
+        </w:tc>
+        <w:tc>
+          <w:tcPr>
+            <w:tcW w:type="dxa" w:w="2160"/>
+          </w:tcPr>
+          <w:p>
+            <w:r>
+              <w:rPr>
+                <w:b/>
+              </w:rPr>
+              <w:t>Valor (US$ MM)</w:t>
+            </w:r>
+          </w:p>
+        </w:tc>
+      </w:tr>
+      <w:tr>
+        <w:tc>
+          <w:tcPr>
+            <w:tcW w:type="dxa" w:w="2160"/>
+          </w:tcPr>
+          <w:p>
+            <w:r>
+              <w:t>Teatinos 120</w:t>
+            </w:r>
+          </w:p>
+        </w:tc>
+        <w:tc>
+          <w:tcPr>
+            <w:tcW w:type="dxa" w:w="2160"/>
+          </w:tcPr>
+          <w:p>
+            <w:r>
+              <w:t>Santiago centro</w:t>
+            </w:r>
+          </w:p>
+        </w:tc>
+        <w:tc>
+          <w:tcPr>
+            <w:tcW w:type="dxa" w:w="2160"/>
+          </w:tcPr>
+          <w:p>
+            <w:r>
+              <w:t>28-50</w:t>
+            </w:r>
+          </w:p>
+        </w:tc>
+        <w:tc>
+          <w:tcPr>
+            <w:tcW w:type="dxa" w:w="2160"/>
+          </w:tcPr>
+          <w:p>
+            <w:r>
+              <w:t>48 - 86</w:t>
+            </w:r>
+          </w:p>
+        </w:tc>
+      </w:tr>
+      <w:tr>
+        <w:tc>
+          <w:tcPr>
+            <w:tcW w:type="dxa" w:w="2160"/>
+          </w:tcPr>
+          <w:p>
+            <w:r>
+              <w:t>Pedro Montt / Isabel Riquelme</w:t>
+            </w:r>
+          </w:p>
+        </w:tc>
+        <w:tc>
+          <w:tcPr>
+            <w:tcW w:type="dxa" w:w="2160"/>
+          </w:tcPr>
+          <w:p>
+            <w:r>
+              <w:t>Santiago/PAC</w:t>
+            </w:r>
+          </w:p>
+        </w:tc>
+        <w:tc>
+          <w:tcPr>
+            <w:tcW w:type="dxa" w:w="2160"/>
+          </w:tcPr>
+          <w:p>
+            <w:r>
+              <w:t>12-22</w:t>
+            </w:r>
+          </w:p>
+        </w:tc>
+        <w:tc>
+          <w:tcPr>
+            <w:tcW w:type="dxa" w:w="2160"/>
+          </w:tcPr>
+          <w:p>
+            <w:r>
+              <w:t>48 - 88</w:t>
+            </w:r>
+          </w:p>
+        </w:tc>
+      </w:tr>
+      <w:tr>
+        <w:tc>
+          <w:tcPr>
+            <w:tcW w:type="dxa" w:w="2160"/>
+          </w:tcPr>
+          <w:p>
+            <w:r>
+              <w:t>Vicuna Mackenna 5065</w:t>
+            </w:r>
+          </w:p>
+        </w:tc>
+        <w:tc>
+          <w:tcPr>
+            <w:tcW w:type="dxa" w:w="2160"/>
+          </w:tcPr>
+          <w:p>
+            <w:r>
+              <w:t>San Joaquin</w:t>
+            </w:r>
+          </w:p>
+        </w:tc>
+        <w:tc>
+          <w:tcPr>
+            <w:tcW w:type="dxa" w:w="2160"/>
+          </w:tcPr>
+          <w:p>
+            <w:r>
+              <w:t>14-22</w:t>
+            </w:r>
+          </w:p>
+        </w:tc>
+        <w:tc>
+          <w:tcPr>
+            <w:tcW w:type="dxa" w:w="2160"/>
+          </w:tcPr>
+          <w:p>
+            <w:r>
+              <w:t>50 - 79</w:t>
+            </w:r>
+          </w:p>
+        </w:tc>
+      </w:tr>
+      <w:tr>
+        <w:tc>
+          <w:tcPr>
+            <w:tcW w:type="dxa" w:w="2160"/>
+          </w:tcPr>
+          <w:p>
+            <w:r>
+              <w:t>Carlos Valdovinos 279</w:t>
+            </w:r>
+          </w:p>
+        </w:tc>
+        <w:tc>
+          <w:tcPr>
+            <w:tcW w:type="dxa" w:w="2160"/>
+          </w:tcPr>
+          <w:p>
+            <w:r>
+              <w:t>San Joaquin</w:t>
+            </w:r>
+          </w:p>
+        </w:tc>
+        <w:tc>
+          <w:tcPr>
+            <w:tcW w:type="dxa" w:w="2160"/>
+          </w:tcPr>
+          <w:p>
+            <w:r>
+              <w:t>14-22</w:t>
+            </w:r>
+          </w:p>
+        </w:tc>
+        <w:tc>
+          <w:tcPr>
+            <w:tcW w:type="dxa" w:w="2160"/>
+          </w:tcPr>
+          <w:p>
+            <w:r>
+              <w:t>43 - 68</w:t>
+            </w:r>
+          </w:p>
+        </w:tc>
+      </w:tr>
+      <w:tr>
+        <w:tc>
+          <w:tcPr>
+            <w:tcW w:type="dxa" w:w="2160"/>
+          </w:tcPr>
+          <w:p>
+            <w:r>
+              <w:t>San Jose 1053</w:t>
+            </w:r>
+          </w:p>
+        </w:tc>
+        <w:tc>
+          <w:tcPr>
+            <w:tcW w:type="dxa" w:w="2160"/>
+          </w:tcPr>
+          <w:p>
+            <w:r>
+              <w:t>Independencia</w:t>
+            </w:r>
+          </w:p>
+        </w:tc>
+        <w:tc>
+          <w:tcPr>
+            <w:tcW w:type="dxa" w:w="2160"/>
+          </w:tcPr>
+          <w:p>
+            <w:r>
+              <w:t>18-30</w:t>
+            </w:r>
+          </w:p>
+        </w:tc>
+        <w:tc>
+          <w:tcPr>
+            <w:tcW w:type="dxa" w:w="2160"/>
+          </w:tcPr>
+          <w:p>
+            <w:r>
+              <w:t>43 - 72</w:t>
+            </w:r>
+          </w:p>
+        </w:tc>
+      </w:tr>
+      <w:tr>
+        <w:tc>
+          <w:tcPr>
+            <w:tcW w:type="dxa" w:w="2160"/>
+          </w:tcPr>
+          <w:p>
+            <w:r>
+              <w:t>Santa Amalia 1022</w:t>
+            </w:r>
+          </w:p>
+        </w:tc>
+        <w:tc>
+          <w:tcPr>
+            <w:tcW w:type="dxa" w:w="2160"/>
+          </w:tcPr>
+          <w:p>
+            <w:r>
+              <w:t>La Florida</w:t>
+            </w:r>
+          </w:p>
+        </w:tc>
+        <w:tc>
+          <w:tcPr>
+            <w:tcW w:type="dxa" w:w="2160"/>
+          </w:tcPr>
+          <w:p>
+            <w:r>
+              <w:t>11-18</w:t>
+            </w:r>
+          </w:p>
+        </w:tc>
+        <w:tc>
+          <w:tcPr>
+            <w:tcW w:type="dxa" w:w="2160"/>
+          </w:tcPr>
+          <w:p>
+            <w:r>
+              <w:t>20 - 33</w:t>
+            </w:r>
+          </w:p>
+        </w:tc>
+      </w:tr>
+      <w:tr>
+        <w:tc>
+          <w:tcPr>
+            <w:tcW w:type="dxa" w:w="2160"/>
+          </w:tcPr>
+          <w:p>
+            <w:r>
+              <w:t>Fundo Cerro Negro</w:t>
+            </w:r>
+          </w:p>
+        </w:tc>
+        <w:tc>
+          <w:tcPr>
+            <w:tcW w:type="dxa" w:w="2160"/>
+          </w:tcPr>
+          <w:p>
+            <w:r>
+              <w:t>San Bernardo</w:t>
+            </w:r>
+          </w:p>
+        </w:tc>
+        <w:tc>
+          <w:tcPr>
+            <w:tcW w:type="dxa" w:w="2160"/>
+          </w:tcPr>
+          <w:p>
+            <w:r>
+              <w:t>3-7</w:t>
+            </w:r>
+          </w:p>
+        </w:tc>
+        <w:tc>
+          <w:tcPr>
+            <w:tcW w:type="dxa" w:w="2160"/>
+          </w:tcPr>
+          <w:p>
+            <w:r>
+              <w:t>12 - 29</w:t>
+            </w:r>
+          </w:p>
+        </w:tc>
+      </w:tr>
+      <w:tr>
+        <w:tc>
+          <w:tcPr>
+            <w:tcW w:type="dxa" w:w="2160"/>
+          </w:tcPr>
+          <w:p>
+            <w:r>
+              <w:t>Camino a Melipilla 641</w:t>
+            </w:r>
+          </w:p>
+        </w:tc>
+        <w:tc>
+          <w:tcPr>
+            <w:tcW w:type="dxa" w:w="2160"/>
+          </w:tcPr>
+          <w:p>
+            <w:r>
+              <w:t>Padre Hurtado</w:t>
+            </w:r>
+          </w:p>
+        </w:tc>
+        <w:tc>
+          <w:tcPr>
+            <w:tcW w:type="dxa" w:w="2160"/>
+          </w:tcPr>
+          <w:p>
+            <w:r>
+              <w:t>4-9</w:t>
+            </w:r>
+          </w:p>
+        </w:tc>
+        <w:tc>
+          <w:tcPr>
+            <w:tcW w:type="dxa" w:w="2160"/>
+          </w:tcPr>
+          <w:p>
+            <w:r>
+              <w:t>10 - 22</w:t>
+            </w:r>
+          </w:p>
+        </w:tc>
+      </w:tr>
+      <w:tr>
+        <w:tc>
+          <w:tcPr>
+            <w:tcW w:type="dxa" w:w="2160"/>
+          </w:tcPr>
+          <w:p>
+            <w:r>
+              <w:t>Ruta G-98-F lote B</w:t>
+            </w:r>
+          </w:p>
+        </w:tc>
+        <w:tc>
+          <w:tcPr>
+            <w:tcW w:type="dxa" w:w="2160"/>
+          </w:tcPr>
+          <w:p>
+            <w:r>
+              <w:t>Cartagena</w:t>
+            </w:r>
+          </w:p>
+        </w:tc>
+        <w:tc>
+          <w:tcPr>
+            <w:tcW w:type="dxa" w:w="2160"/>
+          </w:tcPr>
+          <w:p>
+            <w:r>
+              <w:t>2-5</w:t>
+            </w:r>
+          </w:p>
+        </w:tc>
+        <w:tc>
+          <w:tcPr>
+            <w:tcW w:type="dxa" w:w="2160"/>
+          </w:tcPr>
+          <w:p>
+            <w:r>
+              <w:t>5 - 13</w:t>
+            </w:r>
+          </w:p>
+        </w:tc>
+      </w:tr>
+      <w:tr>
+        <w:tc>
+          <w:tcPr>
+            <w:tcW w:type="dxa" w:w="2160"/>
+          </w:tcPr>
+          <w:p>
+            <w:r>
+              <w:t>Armando Celis lotes 1-7</w:t>
+            </w:r>
+          </w:p>
+        </w:tc>
+        <w:tc>
+          <w:tcPr>
+            <w:tcW w:type="dxa" w:w="2160"/>
+          </w:tcPr>
+          <w:p>
+            <w:r>
+              <w:t>El Tabo</w:t>
+            </w:r>
+          </w:p>
+        </w:tc>
+        <w:tc>
+          <w:tcPr>
+            <w:tcW w:type="dxa" w:w="2160"/>
+          </w:tcPr>
+          <w:p>
+            <w:r>
+              <w:t>2-5</w:t>
+            </w:r>
+          </w:p>
+        </w:tc>
+        <w:tc>
+          <w:tcPr>
+            <w:tcW w:type="dxa" w:w="2160"/>
+          </w:tcPr>
+          <w:p>
+            <w:r>
+              <w:t>5 - 11</w:t>
+            </w:r>
+          </w:p>
+        </w:tc>
+      </w:tr>
+      <w:tr>
+        <w:tc>
+          <w:tcPr>
+            <w:tcW w:type="dxa" w:w="2160"/>
+          </w:tcPr>
+          <w:p>
+            <w:r>
+              <w:t>Ignacio Vicuna</w:t>
+            </w:r>
+          </w:p>
+        </w:tc>
+        <w:tc>
+          <w:tcPr>
+            <w:tcW w:type="dxa" w:w="2160"/>
+          </w:tcPr>
+          <w:p>
+            <w:r>
+              <w:t>San Antonio</w:t>
+            </w:r>
+          </w:p>
+        </w:tc>
+        <w:tc>
+          <w:tcPr>
+            <w:tcW w:type="dxa" w:w="2160"/>
+          </w:tcPr>
+          <w:p>
+            <w:r>
+              <w:t>3-7</w:t>
+            </w:r>
+          </w:p>
+        </w:tc>
+        <w:tc>
+          <w:tcPr>
+            <w:tcW w:type="dxa" w:w="2160"/>
+          </w:tcPr>
+          <w:p>
+            <w:r>
+              <w:t>3 - 8</w:t>
+            </w:r>
+          </w:p>
+        </w:tc>
+      </w:tr>
+    </w:tbl>
+    <w:p>
+      <w:r>
+        <w:rPr>
+          <w:b/>
+          <w:i w:val="0"/>
+        </w:rPr>
+        <w:t>Subtotal 11 joyas urbanas: aprox US$ 288 - 509 millones.</w:t>
+      </w:r>
+    </w:p>
+    <w:p>
+      <w:r>
+        <w:rPr>
+          <w:b w:val="0"/>
+          <w:i w:val="0"/>
+        </w:rPr>
+        <w:t>Aparte: Hijuela La Obra de Chena (San Bernardo, 449,75 ha) ~ US$ 96-383 MM con alta incertidumbre (probable terreno de cerro/no urbanizable).</w:t>
+      </w:r>
+    </w:p>
+    <w:p>
+      <w:r>
+        <w:rPr>
+          <w:b w:val="0"/>
+          <w:i/>
+        </w:rPr>
+        <w:t>Lectura: solo 11 lotes urbanos disponibles igualan o superan la meta de US$200-300 MM del plan completo; el valor se concentra en Santiago centro y pericentro. Caveat: valores brutos de suelo, no tasaciones; UF/m2 de referencia, no avaluos SII.</w:t>
+      </w:r>
+    </w:p>
+    <w:p>
+      <w:pPr>
+        <w:pStyle w:val="Heading1"/>
+      </w:pPr>
+      <w:r>
         <w:t>7. Tarapacá (capa propia)</w:t>
       </w:r>
     </w:p>

</xml_diff>

<commit_message>
Add filtered clean parcel CSV and update report totals
Removes 43 false positives (hills, parks, road/rail strips, >10ha lots);
clean universe: 796 parcels, US$2,045 MM estimated.

Co-Authored-By: Claude Opus 4.8 <noreply@anthropic.com>
Claude-Session: https://claude.ai/code/session_0176Mxnp8jDMs1stsmMK1Rkb
</commit_message>
<xml_diff>
--- a/Informe_terrenos_fiscales_Chile.docx
+++ b/Informe_terrenos_fiscales_Chile.docx
@@ -2194,6 +2194,181 @@
     </w:p>
     <w:p>
       <w:pPr>
+        <w:pStyle w:val="Heading2"/>
+      </w:pPr>
+      <w:r>
+        <w:t>Universo vendible filtrado (CSV)</w:t>
+      </w:r>
+    </w:p>
+    <w:p>
+      <w:r>
+        <w:rPr>
+          <w:b w:val="0"/>
+          <w:i w:val="0"/>
+        </w:rPr>
+        <w:t>Listado completo en predios_fiscales_vendibles.csv (838 predios, valor bruto teorico US$5.142 MM). Tras filtrar falsos positivos (cerros, parques, fajas de camino/FFCC, lotes &gt;10 ha), la version limpia predios_fiscales_vendibles_limpio.csv queda:</w:t>
+      </w:r>
+    </w:p>
+    <w:tbl>
+      <w:tblPr>
+        <w:tblStyle w:val="LightGrid-Accent1"/>
+        <w:tblW w:type="auto" w:w="0"/>
+        <w:tblLook w:firstColumn="1" w:firstRow="1" w:lastColumn="0" w:lastRow="0" w:noHBand="0" w:noVBand="1" w:val="04A0"/>
+      </w:tblPr>
+      <w:tblGrid>
+        <w:gridCol w:w="2880"/>
+        <w:gridCol w:w="2880"/>
+        <w:gridCol w:w="2880"/>
+      </w:tblGrid>
+      <w:tr>
+        <w:tc>
+          <w:tcPr>
+            <w:tcW w:type="dxa" w:w="2880"/>
+          </w:tcPr>
+          <w:p>
+            <w:r>
+              <w:rPr>
+                <w:b/>
+              </w:rPr>
+              <w:t>Tier</w:t>
+            </w:r>
+          </w:p>
+        </w:tc>
+        <w:tc>
+          <w:tcPr>
+            <w:tcW w:type="dxa" w:w="2880"/>
+          </w:tcPr>
+          <w:p>
+            <w:r>
+              <w:rPr>
+                <w:b/>
+              </w:rPr>
+              <w:t>Predios</w:t>
+            </w:r>
+          </w:p>
+        </w:tc>
+        <w:tc>
+          <w:tcPr>
+            <w:tcW w:type="dxa" w:w="2880"/>
+          </w:tcPr>
+          <w:p>
+            <w:r>
+              <w:rPr>
+                <w:b/>
+              </w:rPr>
+              <w:t>Valor estimado</w:t>
+            </w:r>
+          </w:p>
+        </w:tc>
+      </w:tr>
+      <w:tr>
+        <w:tc>
+          <w:tcPr>
+            <w:tcW w:type="dxa" w:w="2880"/>
+          </w:tcPr>
+          <w:p>
+            <w:r>
+              <w:t>1 - disponible/recuperable</w:t>
+            </w:r>
+          </w:p>
+        </w:tc>
+        <w:tc>
+          <w:tcPr>
+            <w:tcW w:type="dxa" w:w="2880"/>
+          </w:tcPr>
+          <w:p>
+            <w:r>
+              <w:t>469</w:t>
+            </w:r>
+          </w:p>
+        </w:tc>
+        <w:tc>
+          <w:tcPr>
+            <w:tcW w:type="dxa" w:w="2880"/>
+          </w:tcPr>
+          <w:p>
+            <w:r>
+              <w:t>US$ 1.336 MM</w:t>
+            </w:r>
+          </w:p>
+        </w:tc>
+      </w:tr>
+      <w:tr>
+        <w:tc>
+          <w:tcPr>
+            <w:tcW w:type="dxa" w:w="2880"/>
+          </w:tcPr>
+          <w:p>
+            <w:r>
+              <w:t>2 - posible</w:t>
+            </w:r>
+          </w:p>
+        </w:tc>
+        <w:tc>
+          <w:tcPr>
+            <w:tcW w:type="dxa" w:w="2880"/>
+          </w:tcPr>
+          <w:p>
+            <w:r>
+              <w:t>327</w:t>
+            </w:r>
+          </w:p>
+        </w:tc>
+        <w:tc>
+          <w:tcPr>
+            <w:tcW w:type="dxa" w:w="2880"/>
+          </w:tcPr>
+          <w:p>
+            <w:r>
+              <w:t>US$ 709 MM</w:t>
+            </w:r>
+          </w:p>
+        </w:tc>
+      </w:tr>
+      <w:tr>
+        <w:tc>
+          <w:tcPr>
+            <w:tcW w:type="dxa" w:w="2880"/>
+          </w:tcPr>
+          <w:p>
+            <w:r>
+              <w:t>Total limpio</w:t>
+            </w:r>
+          </w:p>
+        </w:tc>
+        <w:tc>
+          <w:tcPr>
+            <w:tcW w:type="dxa" w:w="2880"/>
+          </w:tcPr>
+          <w:p>
+            <w:r>
+              <w:t>796</w:t>
+            </w:r>
+          </w:p>
+        </w:tc>
+        <w:tc>
+          <w:tcPr>
+            <w:tcW w:type="dxa" w:w="2880"/>
+          </w:tcPr>
+          <w:p>
+            <w:r>
+              <w:t>US$ 2.045 MM</w:t>
+            </w:r>
+          </w:p>
+        </w:tc>
+      </w:tr>
+    </w:tbl>
+    <w:p>
+      <w:r>
+        <w:rPr>
+          <w:b w:val="0"/>
+          <w:i/>
+        </w:rPr>
+        <w:t>Por region (limpio): Metropolitana US$1.413 MM, Valparaiso US$493 MM, Biobio US$138 MM. Sigue siendo un techo bruto de suelo; lo recaudable real es menor y el plan toma solo un subconjunto (~350 propiedades).</w:t>
+      </w:r>
+    </w:p>
+    <w:p>
+      <w:pPr>
         <w:pStyle w:val="Heading1"/>
       </w:pPr>
       <w:r>

</xml_diff>